<commit_message>
fix: remove self-made blanks for official-form documents; official-form notices instead
</commit_message>
<xml_diff>
--- a/files/platezhnoe-poruchenie-obrazec.v2-0.docx
+++ b/files/platezhnoe-poruchenie-obrazec.v2-0.docx
@@ -13,7 +13,7 @@
           <w:i w:val="0"/>
           <w:sz w:val="30"/>
         </w:rPr>
-        <w:t>ОБРАЗЕЦ ЗАПОЛНЕНИЯ</w:t>
+        <w:t>ПАМЯТКА ПО ЗАПОЛНЕНИЮ</w:t>
       </w:r>
     </w:p>
     <w:p>
@@ -28,7 +28,7 @@
           <w:color w:val="44484C"/>
           <w:sz w:val="23"/>
         </w:rPr>
-        <w:t>распоряжение о казначейском платеже (ключевые поля)</w:t>
+        <w:t>распоряжение о казначейском платеже — ключевые поля (НЕ является бланком: форма распоряжения установлена правилами казначейского обслуживания и заполняется в ГИИС)</w:t>
       </w:r>
     </w:p>
     <w:tbl>

</xml_diff>